<commit_message>
fix(core): address code review - fix double-backticks and eliminate duplicate UUID parsing
Co-authored-by: natarajan0007 <17359328+natarajan0007@users.noreply.github.com>
</commit_message>
<xml_diff>
--- a/libs/core/docs/architecture/LangChain_Architecture_Critique_and_Improvement_Plan.docx
+++ b/libs/core/docs/architecture/LangChain_Architecture_Critique_and_Improvement_Plan.docx
@@ -3323,7 +3323,7 @@
         <w:br/>
         <w:t xml:space="preserve">        return {</w:t>
         <w:br/>
-        <w:t xml:space="preserve">            "run_id": uuid.UUID(self.span_id) if self._is_valid_uuid(self.span_id) else None,</w:t>
+        <w:t xml:space="preserve">            "run_id": self._try_parse_uuid(self.span_id),</w:t>
         <w:br/>
         <w:t xml:space="preserve">            "tags": list(self.tags),</w:t>
         <w:br/>
@@ -3366,6 +3366,33 @@
         <w:t xml:space="preserve">            return [self.span_id]</w:t>
         <w:br/>
         <w:t xml:space="preserve">        return [self.parent_span_id, self.span_id]</w:t>
+        <w:br/>
+        <w:br/>
+        <w:t xml:space="preserve">    @staticmethod</w:t>
+        <w:br/>
+        <w:t xml:space="preserve">    def _try_parse_uuid(val: str) -&gt; uuid.UUID | None:</w:t>
+        <w:br/>
+        <w:t xml:space="preserve">        """Try to parse a string as a UUID.</w:t>
+        <w:br/>
+        <w:br/>
+        <w:t xml:space="preserve">        Args:</w:t>
+        <w:br/>
+        <w:t xml:space="preserve">            val: The string to parse.</w:t>
+        <w:br/>
+        <w:br/>
+        <w:t xml:space="preserve">        Returns:</w:t>
+        <w:br/>
+        <w:t xml:space="preserve">            The parsed `uuid.UUID`, or `None` if the string is not valid.</w:t>
+        <w:br/>
+        <w:t xml:space="preserve">        """</w:t>
+        <w:br/>
+        <w:t xml:space="preserve">        try:</w:t>
+        <w:br/>
+        <w:t xml:space="preserve">            return uuid.UUID(val)</w:t>
+        <w:br/>
+        <w:t xml:space="preserve">        except (ValueError, AttributeError):</w:t>
+        <w:br/>
+        <w:t xml:space="preserve">            return None</w:t>
         <w:br/>
         <w:br/>
         <w:t xml:space="preserve">    @staticmethod</w:t>
@@ -3504,6 +3531,68 @@
         <w:br/>
         <w:br/>
         <w:br/>
+        <w:t>def _parse_or_generate_uuid(val: str | None) -&gt; uuid_mod.UUID | None:</w:t>
+        <w:br/>
+        <w:t xml:space="preserve">    """Parse a string as UUID, falling back to a new UUID or None.</w:t>
+        <w:br/>
+        <w:br/>
+        <w:t xml:space="preserve">    Args:</w:t>
+        <w:br/>
+        <w:t xml:space="preserve">        val: The string to parse. If ``None``, returns ``None``.</w:t>
+        <w:br/>
+        <w:br/>
+        <w:t xml:space="preserve">    Returns:</w:t>
+        <w:br/>
+        <w:t xml:space="preserve">        Parsed UUID, a new random UUID if parsing fails on a non-None value,</w:t>
+        <w:br/>
+        <w:t xml:space="preserve">        or ``None`` if val was ``None``.</w:t>
+        <w:br/>
+        <w:t xml:space="preserve">    """</w:t>
+        <w:br/>
+        <w:t xml:space="preserve">    if val is None:</w:t>
+        <w:br/>
+        <w:t xml:space="preserve">        return None</w:t>
+        <w:br/>
+        <w:t xml:space="preserve">    try:</w:t>
+        <w:br/>
+        <w:t xml:space="preserve">        return uuid_mod.UUID(val)</w:t>
+        <w:br/>
+        <w:t xml:space="preserve">    except (ValueError, AttributeError):</w:t>
+        <w:br/>
+        <w:t xml:space="preserve">        return uuid_mod.uuid4()</w:t>
+        <w:br/>
+        <w:br/>
+        <w:br/>
+        <w:t>def _parse_uuid_or_none(val: str | None) -&gt; uuid_mod.UUID | None:</w:t>
+        <w:br/>
+        <w:t xml:space="preserve">    """Parse a string as UUID, returning None if invalid or input is None.</w:t>
+        <w:br/>
+        <w:br/>
+        <w:t xml:space="preserve">    Args:</w:t>
+        <w:br/>
+        <w:t xml:space="preserve">        val: The string to parse.</w:t>
+        <w:br/>
+        <w:br/>
+        <w:t xml:space="preserve">    Returns:</w:t>
+        <w:br/>
+        <w:t xml:space="preserve">        Parsed UUID or ``None``.</w:t>
+        <w:br/>
+        <w:t xml:space="preserve">    """</w:t>
+        <w:br/>
+        <w:t xml:space="preserve">    if val is None:</w:t>
+        <w:br/>
+        <w:t xml:space="preserve">        return None</w:t>
+        <w:br/>
+        <w:t xml:space="preserve">    try:</w:t>
+        <w:br/>
+        <w:t xml:space="preserve">        return uuid_mod.UUID(val)</w:t>
+        <w:br/>
+        <w:t xml:space="preserve">    except (ValueError, AttributeError):</w:t>
+        <w:br/>
+        <w:t xml:space="preserve">        return None</w:t>
+        <w:br/>
+        <w:br/>
+        <w:br/>
         <w:t>@runtime_checkable</w:t>
         <w:br/>
         <w:t>class InstrumentationProvider(Protocol):</w:t>
@@ -3829,27 +3918,9 @@
         <w:t xml:space="preserve">        """</w:t>
         <w:br/>
         <w:br/>
-        <w:t xml:space="preserve">        run_id = (</w:t>
-        <w:br/>
-        <w:t xml:space="preserve">            uuid_mod.UUID(context.span_id)</w:t>
-        <w:br/>
-        <w:t xml:space="preserve">            if ExecutionContext._is_valid_uuid(context.span_id)</w:t>
-        <w:br/>
-        <w:t xml:space="preserve">            else uuid_mod.uuid4()</w:t>
-        <w:br/>
-        <w:t xml:space="preserve">        )</w:t>
-        <w:br/>
-        <w:t xml:space="preserve">        parent_run_id = (</w:t>
-        <w:br/>
-        <w:t xml:space="preserve">            uuid_mod.UUID(context.parent_span_id)</w:t>
-        <w:br/>
-        <w:t xml:space="preserve">            if context.parent_span_id</w:t>
-        <w:br/>
-        <w:t xml:space="preserve">            and ExecutionContext._is_valid_uuid(context.parent_span_id)</w:t>
-        <w:br/>
-        <w:t xml:space="preserve">            else None</w:t>
-        <w:br/>
-        <w:t xml:space="preserve">        )</w:t>
+        <w:t xml:space="preserve">        run_id = _parse_or_generate_uuid(context.span_id)</w:t>
+        <w:br/>
+        <w:t xml:space="preserve">        parent_run_id = _parse_uuid_or_none(context.parent_span_id)</w:t>
         <w:br/>
         <w:br/>
         <w:t xml:space="preserve">        event_name = {</w:t>
@@ -3928,15 +3999,7 @@
         <w:t xml:space="preserve">        """</w:t>
         <w:br/>
         <w:br/>
-        <w:t xml:space="preserve">        run_id = (</w:t>
-        <w:br/>
-        <w:t xml:space="preserve">            uuid_mod.UUID(context.span_id)</w:t>
-        <w:br/>
-        <w:t xml:space="preserve">            if ExecutionContext._is_valid_uuid(context.span_id)</w:t>
-        <w:br/>
-        <w:t xml:space="preserve">            else uuid_mod.uuid4()</w:t>
-        <w:br/>
-        <w:t xml:space="preserve">        )</w:t>
+        <w:t xml:space="preserve">        run_id = _parse_or_generate_uuid(context.span_id)</w:t>
         <w:br/>
         <w:br/>
         <w:t xml:space="preserve">        event_name = {</w:t>
@@ -4001,15 +4064,7 @@
         <w:t xml:space="preserve">        """</w:t>
         <w:br/>
         <w:br/>
-        <w:t xml:space="preserve">        run_id = (</w:t>
-        <w:br/>
-        <w:t xml:space="preserve">            uuid_mod.UUID(context.span_id)</w:t>
-        <w:br/>
-        <w:t xml:space="preserve">            if ExecutionContext._is_valid_uuid(context.span_id)</w:t>
-        <w:br/>
-        <w:t xml:space="preserve">            else uuid_mod.uuid4()</w:t>
-        <w:br/>
-        <w:t xml:space="preserve">        )</w:t>
+        <w:t xml:space="preserve">        run_id = _parse_or_generate_uuid(context.span_id)</w:t>
         <w:br/>
         <w:br/>
         <w:t xml:space="preserve">        event_name = {</w:t>
@@ -4110,15 +4165,7 @@
         <w:t xml:space="preserve">        """</w:t>
         <w:br/>
         <w:br/>
-        <w:t xml:space="preserve">        run_id = (</w:t>
-        <w:br/>
-        <w:t xml:space="preserve">            uuid_mod.UUID(context.span_id)</w:t>
-        <w:br/>
-        <w:t xml:space="preserve">            if ExecutionContext._is_valid_uuid(context.span_id)</w:t>
-        <w:br/>
-        <w:t xml:space="preserve">            else uuid_mod.uuid4()</w:t>
-        <w:br/>
-        <w:t xml:space="preserve">        )</w:t>
+        <w:t xml:space="preserve">        run_id = _parse_or_generate_uuid(context.span_id)</w:t>
         <w:br/>
         <w:br/>
         <w:t xml:space="preserve">        text = f"[{name}] {data}" if data else f"[{name}]"</w:t>
@@ -4184,18 +4231,18 @@
         <w:t>context is fragmented across multiple systems:</w:t>
         <w:br/>
         <w:br/>
-        <w:t>1. ``RunnableConfig`` (tags, metadata, run_id)</w:t>
-        <w:br/>
-        <w:t>2. ``CallbackManager`` (run_id, parent_run_id, handlers)</w:t>
-        <w:br/>
-        <w:t>3. ``var_child_runnable_config`` ContextVar (implicit propagation)</w:t>
-        <w:br/>
-        <w:t>4. Tracer ``run_map`` (hierarchical run tree)</w:t>
+        <w:t>1. `RunnableConfig` (tags, metadata, run_id)</w:t>
+        <w:br/>
+        <w:t>2. `CallbackManager` (run_id, parent_run_id, handlers)</w:t>
+        <w:br/>
+        <w:t>3. `var_child_runnable_config` ContextVar (implicit propagation)</w:t>
+        <w:br/>
+        <w:t>4. Tracer `run_map` (hierarchical run tree)</w:t>
         <w:br/>
         <w:br/>
         <w:t>A component executing within a chain must understand all four systems to</w:t>
         <w:br/>
-        <w:t>reconstruct its full execution context. The proposed ``ExecutionContext``</w:t>
+        <w:t>reconstruct its full execution context. The proposed `ExecutionContext`</w:t>
         <w:br/>
         <w:t>provides a single unified API.</w:t>
         <w:br/>

</xml_diff>